<commit_message>
[Manas]: 6th July 2026
</commit_message>
<xml_diff>
--- a/Recursion/Recursion Notes.docx
+++ b/Recursion/Recursion Notes.docx
@@ -6,11 +6,15 @@
       <w:pPr>
         <w:jc w:val="center"/>
         <w:rPr>
+          <w:b/>
+          <w:bCs/>
           <w:u w:val="single"/>
         </w:rPr>
       </w:pPr>
       <w:r>
         <w:rPr>
+          <w:b/>
+          <w:bCs/>
           <w:u w:val="single"/>
         </w:rPr>
         <w:t>Recursion</w:t>
@@ -127,7 +131,15 @@
       </w:r>
       <w:proofErr w:type="spellEnd"/>
       <w:r>
-        <w:t>: - solve one of the case yourself</w:t>
+        <w:t xml:space="preserve">: - solve one of the </w:t>
+      </w:r>
+      <w:proofErr w:type="gramStart"/>
+      <w:r>
+        <w:t>case</w:t>
+      </w:r>
+      <w:proofErr w:type="gramEnd"/>
+      <w:r>
+        <w:t xml:space="preserve"> yourself</w:t>
       </w:r>
       <w:r>
         <w:br/>
@@ -150,13 +162,23 @@
     </w:p>
     <w:p>
       <w:r>
-        <w:t xml:space="preserve">It helps us solve bigger and complex problems in simpler way. The Space complexity is not constant because of the recursive calls. Each function call needs memory in the stack that’s why </w:t>
+        <w:t xml:space="preserve">It helps us solve bigger and complex problems in simpler </w:t>
+      </w:r>
+      <w:proofErr w:type="gramStart"/>
+      <w:r>
+        <w:t>way</w:t>
+      </w:r>
+      <w:proofErr w:type="gramEnd"/>
+      <w:r>
+        <w:t xml:space="preserve">. The Space complexity is not constant because of the recursive calls. Each function call needs memory in the stack that’s why </w:t>
       </w:r>
       <w:proofErr w:type="spellStart"/>
+      <w:proofErr w:type="gramStart"/>
       <w:r>
         <w:t>its</w:t>
       </w:r>
       <w:proofErr w:type="spellEnd"/>
+      <w:proofErr w:type="gramEnd"/>
       <w:r>
         <w:t xml:space="preserve"> not constant.</w:t>
       </w:r>
@@ -283,6 +305,9 @@
     </w:p>
     <w:p>
       <w:r>
+        <w:rPr>
+          <w:noProof/>
+        </w:rPr>
         <w:drawing>
           <wp:inline distT="0" distB="0" distL="0" distR="0" wp14:anchorId="0B97A9FE" wp14:editId="36A99590">
             <wp:extent cx="4868704" cy="2972197"/>
@@ -328,6 +353,7 @@
       <w:r>
         <w:t xml:space="preserve">return </w:t>
       </w:r>
+      <w:proofErr w:type="gramStart"/>
       <w:r>
         <w:rPr>
           <w:i/>
@@ -336,8 +362,13 @@
         <w:t>fib</w:t>
       </w:r>
       <w:r>
-        <w:t xml:space="preserve">(n - 1) + </w:t>
-      </w:r>
+        <w:t>(</w:t>
+      </w:r>
+      <w:proofErr w:type="gramEnd"/>
+      <w:r>
+        <w:t xml:space="preserve">n - 1) + </w:t>
+      </w:r>
+      <w:proofErr w:type="gramStart"/>
       <w:r>
         <w:rPr>
           <w:i/>
@@ -346,7 +377,11 @@
         <w:t>fib</w:t>
       </w:r>
       <w:r>
-        <w:t>(n - 2);</w:t>
+        <w:t>(</w:t>
+      </w:r>
+      <w:proofErr w:type="gramEnd"/>
+      <w:r>
+        <w:t>n - 2);</w:t>
       </w:r>
       <w:r>
         <w:t>” so the left part of the tree will be called first and until and unless the left part of the tree doesn’t give the answer, the right part of the tree will not execute.</w:t>
@@ -357,6 +392,150 @@
         <w:t>Draw the tree every time on the pen and paper. See how the values are returned at each step.</w:t>
       </w:r>
     </w:p>
+    <w:p/>
+    <w:p>
+      <w:pPr>
+        <w:rPr>
+          <w:b/>
+          <w:bCs/>
+        </w:rPr>
+      </w:pPr>
+      <w:r>
+        <w:rPr>
+          <w:b/>
+          <w:bCs/>
+        </w:rPr>
+        <w:t>DEBUG THE RECURSION CODES TO SEE THE WORKFLOW OF THE CODE AND HOW THE STACK MEMORY IS GETTING FULL AND GOING DOWN.</w:t>
+      </w:r>
+    </w:p>
+    <w:p/>
+    <w:p>
+      <w:pPr>
+        <w:rPr>
+          <w:b/>
+          <w:bCs/>
+        </w:rPr>
+      </w:pPr>
+      <w:r>
+        <w:rPr>
+          <w:b/>
+          <w:bCs/>
+        </w:rPr>
+        <w:t>Recursion&gt;Easy</w:t>
+      </w:r>
+    </w:p>
+    <w:p>
+      <w:r>
+        <w:t xml:space="preserve">Printing the numbers from 1 to n: - I debugged the code to understand the flow of the code and how it’s working. Whatever the BC is until that is achieved, it will keep going to the recursive call and when the BC is hit it will start printing all the numbers stored in the stack one by one. Compare this program with the printing of n to 1 it will clear the concepts. </w:t>
+      </w:r>
+    </w:p>
+    <w:p/>
+    <w:p>
+      <w:r>
+        <w:t>Question of Sum of Digits: - if the N is 1342 then the output should be (1+3+4+2) here is how the tree is working and the flow of the code is.</w:t>
+      </w:r>
+      <w:r>
+        <w:br/>
+        <w:t xml:space="preserve">Recursive Call - &gt; (n%10) + </w:t>
+      </w:r>
+      <w:proofErr w:type="spellStart"/>
+      <w:r>
+        <w:t>func</w:t>
+      </w:r>
+      <w:proofErr w:type="spellEnd"/>
+      <w:r>
+        <w:t>(n/</w:t>
+      </w:r>
+      <w:proofErr w:type="gramStart"/>
+      <w:r>
+        <w:t>10)…</w:t>
+      </w:r>
+      <w:proofErr w:type="gramEnd"/>
+      <w:r>
+        <w:t xml:space="preserve">.{example : </w:t>
+      </w:r>
+      <w:r>
+        <w:t>1342%10 = 2 + 1342/10 = 134</w:t>
+      </w:r>
+      <w:r>
+        <w:t>}</w:t>
+      </w:r>
+    </w:p>
+    <w:p>
+      <w:r>
+        <w:drawing>
+          <wp:inline distT="0" distB="0" distL="0" distR="0" wp14:anchorId="67E6A4EF" wp14:editId="7A2A4B13">
+            <wp:extent cx="4046220" cy="3416621"/>
+            <wp:effectExtent l="0" t="0" r="0" b="0"/>
+            <wp:docPr id="909973248" name="Picture 1"/>
+            <wp:cNvGraphicFramePr>
+              <a:graphicFrameLocks xmlns:a="http://schemas.openxmlformats.org/drawingml/2006/main" noChangeAspect="1"/>
+            </wp:cNvGraphicFramePr>
+            <a:graphic xmlns:a="http://schemas.openxmlformats.org/drawingml/2006/main">
+              <a:graphicData uri="http://schemas.openxmlformats.org/drawingml/2006/picture">
+                <pic:pic xmlns:pic="http://schemas.openxmlformats.org/drawingml/2006/picture">
+                  <pic:nvPicPr>
+                    <pic:cNvPr id="909973248" name=""/>
+                    <pic:cNvPicPr/>
+                  </pic:nvPicPr>
+                  <pic:blipFill>
+                    <a:blip r:embed="rId7"/>
+                    <a:stretch>
+                      <a:fillRect/>
+                    </a:stretch>
+                  </pic:blipFill>
+                  <pic:spPr>
+                    <a:xfrm>
+                      <a:off x="0" y="0"/>
+                      <a:ext cx="4077189" cy="3442771"/>
+                    </a:xfrm>
+                    <a:prstGeom prst="rect">
+                      <a:avLst/>
+                    </a:prstGeom>
+                  </pic:spPr>
+                </pic:pic>
+              </a:graphicData>
+            </a:graphic>
+          </wp:inline>
+        </w:drawing>
+      </w:r>
+    </w:p>
+    <w:p>
+      <w:r>
+        <w:lastRenderedPageBreak/>
+        <w:t>We should follow the same concept as above to solve the same question for product.</w:t>
+      </w:r>
+    </w:p>
+    <w:p/>
+    <w:p>
+      <w:r>
+        <w:t xml:space="preserve">Concept: - in recursion if you use </w:t>
+      </w:r>
+      <w:proofErr w:type="spellStart"/>
+      <w:r>
+        <w:t>func</w:t>
+      </w:r>
+      <w:proofErr w:type="spellEnd"/>
+      <w:r>
+        <w:t xml:space="preserve">(n--) vs </w:t>
+      </w:r>
+      <w:proofErr w:type="spellStart"/>
+      <w:proofErr w:type="gramStart"/>
+      <w:r>
+        <w:t>func</w:t>
+      </w:r>
+      <w:proofErr w:type="spellEnd"/>
+      <w:r>
+        <w:t>(</w:t>
+      </w:r>
+      <w:proofErr w:type="gramEnd"/>
+      <w:r>
+        <w:t>--n) these both are very different. n—will pass the value of the n first and then subtract and might cause infinite recursion and the other one subtract first and then pass (--n).</w:t>
+      </w:r>
+    </w:p>
+    <w:p/>
+    <w:p/>
+    <w:p/>
     <w:p/>
     <w:p/>
     <w:sectPr>

</xml_diff>